<commit_message>
Redline refreshed through the Horacio paragraph
Co-Authored-By: Claude Fable 5.1 <noreply@anthropic.com>
Claude-Session: https://claude.ai/code/session_013TTacQAr67Pe2VUwTPop1A
</commit_message>
<xml_diff>
--- a/The_Cardinals_Promise_Redline_for_Scott.docx
+++ b/The_Cardinals_Promise_Redline_for_Scott.docx
@@ -4785,10 +4785,52 @@
     </w:p>
     <w:p>
       <w:r>
-        <w:rPr>
-          <w:b w:val="0"/>
-        </w:rPr>
-        <w:t>The rescue had bought me time, and I used it to get worse. Christmas 2008, I went to New Orleans to spend the holiday with my mother.</w:t>
+        <w:t xml:space="preserve">The rescue had bought me time, and I used it to get worse. Christmas 2008, </w:t>
+      </w:r>
+      <w:r>
+        <w:rPr>
+          <w:strike/>
+          <w:color w:val="C00000"/>
+        </w:rPr>
+        <w:t xml:space="preserve">I went to </w:t>
+      </w:r>
+      <w:r>
+        <w:rPr>
+          <w:color w:val="C00000"/>
+        </w:rPr>
+        <w:t xml:space="preserve">my mother was living in Pennsylvania, and the two of us met in </w:t>
+      </w:r>
+      <w:r>
+        <w:t xml:space="preserve">New Orleans </w:t>
+      </w:r>
+      <w:r>
+        <w:rPr>
+          <w:strike/>
+          <w:color w:val="C00000"/>
+        </w:rPr>
+        <w:t xml:space="preserve">to spend </w:t>
+      </w:r>
+      <w:r>
+        <w:rPr>
+          <w:color w:val="C00000"/>
+        </w:rPr>
+        <w:t xml:space="preserve">for </w:t>
+      </w:r>
+      <w:r>
+        <w:t xml:space="preserve">the </w:t>
+      </w:r>
+      <w:r>
+        <w:rPr>
+          <w:strike/>
+          <w:color w:val="C00000"/>
+        </w:rPr>
+        <w:t xml:space="preserve">holiday with my mother. </w:t>
+      </w:r>
+      <w:r>
+        <w:rPr>
+          <w:color w:val="C00000"/>
+        </w:rPr>
+        <w:t xml:space="preserve">holiday. </w:t>
       </w:r>
     </w:p>
     <w:p>
@@ -5645,10 +5687,119 @@
     </w:p>
     <w:p>
       <w:r>
-        <w:rPr>
-          <w:b w:val="0"/>
-        </w:rPr>
-        <w:t>Years into the friendship, at the business conference he built for the city, he was speaking, and he paused and looked out into the crowd. Lou Brizzi, great guy. Chris and Rob, you know them? Hearing my father's name in a room like that stopped me. My dad worked at Baptist Hospital for years, showed up, did the job well, treated people right, stayed until he was eighty-two. Quint saying his name in a room full of leaders honored the life my father believed in.</w:t>
+        <w:t xml:space="preserve">Years into the friendship, at the business conference he built for the city, </w:t>
+      </w:r>
+      <w:r>
+        <w:rPr>
+          <w:strike/>
+          <w:color w:val="C00000"/>
+        </w:rPr>
+        <w:t xml:space="preserve">he </w:t>
+      </w:r>
+      <w:r>
+        <w:rPr>
+          <w:color w:val="C00000"/>
+        </w:rPr>
+        <w:t xml:space="preserve">Quint </w:t>
+      </w:r>
+      <w:r>
+        <w:t xml:space="preserve">was speaking, and he </w:t>
+      </w:r>
+      <w:r>
+        <w:rPr>
+          <w:strike/>
+          <w:color w:val="C00000"/>
+        </w:rPr>
+        <w:t xml:space="preserve">paused and </w:t>
+      </w:r>
+      <w:r>
+        <w:rPr>
+          <w:color w:val="C00000"/>
+        </w:rPr>
+        <w:t xml:space="preserve">paused, </w:t>
+      </w:r>
+      <w:r>
+        <w:t xml:space="preserve">looked out into the </w:t>
+      </w:r>
+      <w:r>
+        <w:rPr>
+          <w:strike/>
+          <w:color w:val="C00000"/>
+        </w:rPr>
+        <w:t xml:space="preserve">crowd. [Lou </w:t>
+      </w:r>
+      <w:r>
+        <w:rPr>
+          <w:color w:val="C00000"/>
+        </w:rPr>
+        <w:t xml:space="preserve">crowd, and found Chris and me. "Lou </w:t>
+      </w:r>
+      <w:r>
+        <w:t xml:space="preserve">Brizzi, great </w:t>
+      </w:r>
+      <w:r>
+        <w:rPr>
+          <w:strike/>
+          <w:color w:val="C00000"/>
+        </w:rPr>
+        <w:t xml:space="preserve">guy. Chris </w:t>
+      </w:r>
+      <w:r>
+        <w:rPr>
+          <w:color w:val="C00000"/>
+        </w:rPr>
+        <w:t xml:space="preserve">guy," he said to the room. "Chris </w:t>
+      </w:r>
+      <w:r>
+        <w:t xml:space="preserve">and Rob, you know </w:t>
+      </w:r>
+      <w:r>
+        <w:rPr>
+          <w:strike/>
+          <w:color w:val="C00000"/>
+        </w:rPr>
+        <w:t xml:space="preserve">them?] </w:t>
+      </w:r>
+      <w:r>
+        <w:rPr>
+          <w:color w:val="C00000"/>
+        </w:rPr>
+        <w:t xml:space="preserve">them?" My father wasn't there. </w:t>
+      </w:r>
+      <w:r>
+        <w:t xml:space="preserve">Hearing </w:t>
+      </w:r>
+      <w:r>
+        <w:rPr>
+          <w:strike/>
+          <w:color w:val="C00000"/>
+        </w:rPr>
+        <w:t xml:space="preserve">my father's </w:t>
+      </w:r>
+      <w:r>
+        <w:rPr>
+          <w:color w:val="C00000"/>
+        </w:rPr>
+        <w:t xml:space="preserve">his </w:t>
+      </w:r>
+      <w:r>
+        <w:t xml:space="preserve">name in a room like that stopped </w:t>
+      </w:r>
+      <w:r>
+        <w:rPr>
+          <w:strike/>
+          <w:color w:val="C00000"/>
+        </w:rPr>
+        <w:t xml:space="preserve">me. </w:t>
+      </w:r>
+      <w:r>
+        <w:rPr>
+          <w:color w:val="C00000"/>
+        </w:rPr>
+        <w:t xml:space="preserve">me anyway. </w:t>
+      </w:r>
+      <w:r>
+        <w:t xml:space="preserve">My dad worked at Baptist Hospital for years, showed up, did the job well, treated people right, stayed until he was eighty-two. Quint saying his name in a room full of leaders honored the life my father believed in. </w:t>
       </w:r>
     </w:p>
     <w:p>
@@ -6805,10 +6956,23 @@
     </w:p>
     <w:p>
       <w:r>
-        <w:rPr>
-          <w:b w:val="0"/>
-        </w:rPr>
-        <w:t>"Rob," he said, "I'll loan it to you and I won't ask you a dollar for it. But if you don't pay it back, it'll affect our relationship."</w:t>
+        <w:t xml:space="preserve">"Rob," he said, "I'll loan it to </w:t>
+      </w:r>
+      <w:r>
+        <w:rPr>
+          <w:strike/>
+          <w:color w:val="C00000"/>
+        </w:rPr>
+        <w:t xml:space="preserve">you </w:t>
+      </w:r>
+      <w:r>
+        <w:rPr>
+          <w:color w:val="C00000"/>
+        </w:rPr>
+        <w:t xml:space="preserve">you, interest free, </w:t>
+      </w:r>
+      <w:r>
+        <w:t xml:space="preserve">and I won't ask you a dollar for it. But if you don't pay it back, it'll affect our relationship." </w:t>
       </w:r>
     </w:p>
     <w:p>
@@ -7011,7 +7175,7 @@
         <w:rPr>
           <w:color w:val="C00000"/>
         </w:rPr>
-        <w:t xml:space="preserve">closer to it than I wanted to know. Up close, the anger I had carried for so long began to turn into something quieter. </w:t>
+        <w:t xml:space="preserve">closer to it than I wanted to know. Up close, the anger I had carried for so long started to turn into pity, and pity is harder to hold onto. </w:t>
       </w:r>
     </w:p>
     <w:p>
@@ -7038,6 +7202,15 @@
           <w:b w:val="0"/>
         </w:rPr>
         <w:t>What I couldn't do was become the son he wanted. He was looking for a relationship I didn't have in me to give. What took me longest was seeing those as two separate things — that you can forgive a man completely and still not be able to hand him your life.</w:t>
+      </w:r>
+    </w:p>
+    <w:p>
+      <w:r>
+        <w:rPr>
+          <w:b w:val="0"/>
+          <w:color w:val="C00000"/>
+        </w:rPr>
+        <w:t>There are reasons I keep him at a distance that I'm not going to put on a page. I've written down almost everything else in this book. Not this. I sit with families who keep one door shut, and I've learned to let them. I'm asking you for the same.</w:t>
       </w:r>
     </w:p>
     <w:p>

</xml_diff>